<commit_message>
Update MoMo IPO preparation milestones
</commit_message>
<xml_diff>
--- a/00_進行管理/未確定事項一覧.docx
+++ b/00_進行管理/未確定事項一覧.docx
@@ -5019,7 +5019,7 @@
                 <w:i w:val="0"/>
                 <w:sz w:val="18"/>
               </w:rPr>
-              <w:t>SaaS</w:t>
+              <w:t>SaaS事業部</w:t>
             </w:r>
           </w:p>
         </w:tc>
@@ -5039,7 +5039,7 @@
                 <w:i w:val="0"/>
                 <w:sz w:val="18"/>
               </w:rPr>
-              <w:t>SaaS管理画面、障害対応、ログ管理、サービス停止基準、個人情報範囲</w:t>
+              <w:t>開発部配下の事業部としての責任者、SaaS管理画面、障害対応、ログ管理、サービス停止基準、個人情報範囲</w:t>
             </w:r>
           </w:p>
         </w:tc>
@@ -5059,7 +5059,7 @@
                 <w:i w:val="0"/>
                 <w:sz w:val="18"/>
               </w:rPr>
-              <w:t>システム管理規程、情報セキュリティ管理規程、与信管理規程</w:t>
+              <w:t>組織規程、業務分掌規程、システム管理規程、情報セキュリティ管理規程、与信管理規程</w:t>
             </w:r>
           </w:p>
         </w:tc>
@@ -5224,88 +5224,6 @@
                 <w:sz w:val="18"/>
               </w:rPr>
               <w:t>業務分掌規程、資金管理規程、文書管理規程</w:t>
-            </w:r>
-          </w:p>
-        </w:tc>
-      </w:tr>
-      <w:tr>
-        <w:tc>
-          <w:tcPr>
-            <w:tcW w:type="dxa" w:w="2340"/>
-            <w:vAlign w:val="top"/>
-          </w:tcPr>
-          <w:p>
-            <w:pPr>
-              <w:spacing w:before="0" w:after="0" w:line="264" w:lineRule="auto"/>
-            </w:pPr>
-            <w:r>
-              <w:rPr>
-                <w:rFonts w:ascii="Yu Gothic" w:hAnsi="Yu Gothic" w:eastAsia="Yu Gothic" w:cs="Yu Gothic"/>
-                <w:b w:val="0"/>
-                <w:i w:val="0"/>
-                <w:sz w:val="18"/>
-              </w:rPr>
-              <w:t>C</w:t>
-            </w:r>
-          </w:p>
-        </w:tc>
-        <w:tc>
-          <w:tcPr>
-            <w:tcW w:type="dxa" w:w="2340"/>
-            <w:vAlign w:val="top"/>
-          </w:tcPr>
-          <w:p>
-            <w:pPr>
-              <w:spacing w:before="0" w:after="0" w:line="264" w:lineRule="auto"/>
-            </w:pPr>
-            <w:r>
-              <w:rPr>
-                <w:rFonts w:ascii="Yu Gothic" w:hAnsi="Yu Gothic" w:eastAsia="Yu Gothic" w:cs="Yu Gothic"/>
-                <w:b w:val="0"/>
-                <w:i w:val="0"/>
-                <w:sz w:val="18"/>
-              </w:rPr>
-              <w:t>ロムちゃん/すぐつくAI/Context Chat</w:t>
-            </w:r>
-          </w:p>
-        </w:tc>
-        <w:tc>
-          <w:tcPr>
-            <w:tcW w:type="dxa" w:w="2340"/>
-            <w:vAlign w:val="top"/>
-          </w:tcPr>
-          <w:p>
-            <w:pPr>
-              <w:spacing w:before="0" w:after="0" w:line="264" w:lineRule="auto"/>
-            </w:pPr>
-            <w:r>
-              <w:rPr>
-                <w:rFonts w:ascii="Yu Gothic" w:hAnsi="Yu Gothic" w:eastAsia="Yu Gothic" w:cs="Yu Gothic"/>
-                <w:b w:val="0"/>
-                <w:i w:val="0"/>
-                <w:sz w:val="18"/>
-              </w:rPr>
-              <w:t>開発責任者、運用環境、ログ、顧客データ、障害対応</w:t>
-            </w:r>
-          </w:p>
-        </w:tc>
-        <w:tc>
-          <w:tcPr>
-            <w:tcW w:type="dxa" w:w="2340"/>
-            <w:vAlign w:val="top"/>
-          </w:tcPr>
-          <w:p>
-            <w:pPr>
-              <w:spacing w:before="0" w:after="0" w:line="264" w:lineRule="auto"/>
-            </w:pPr>
-            <w:r>
-              <w:rPr>
-                <w:rFonts w:ascii="Yu Gothic" w:hAnsi="Yu Gothic" w:eastAsia="Yu Gothic" w:cs="Yu Gothic"/>
-                <w:b w:val="0"/>
-                <w:i w:val="0"/>
-                <w:sz w:val="18"/>
-              </w:rPr>
-              <w:t>システム管理規程、情報セキュリティ管理規程、クレーム管理規程</w:t>
             </w:r>
           </w:p>
         </w:tc>
@@ -6930,7 +6848,7 @@
                 <w:i w:val="0"/>
                 <w:sz w:val="18"/>
               </w:rPr>
-              <w:t>金額基準は10万円以上代表承認、50万円以上経営会議又は取締役会報告、100万円以上原則取締役会決議で確定。稟議はNotionで運用開始し、稟議書様式はGoogleドキュメントで作成する。事後稟議は3営業日以内。契約締結前の確認者は塚原、最終承認・押印/電子署名は伊藤翔。支払、銀行振込、資金移動、発注、採用の最終承認者は伊藤翔。取締役会への上程基準は100万円以上の重要支出・契約・外注・借入・投資等を原則とする。</w:t>
+              <w:t>金額基準は10万円以上代表承認、50万円以上経営会議又は取締役会報告、100万円以上原則取締役会決議で確定。稟議はNotionで運用開始し、稟議書様式はGoogleドキュメントで作成する。事後稟議は3営業日以内。契約締結前の確認は管理部が主管し、塚原（業務委託）が契約内容の確認を支援する。最終承認・押印/電子署名は伊藤翔。支払、銀行振込、資金移動、発注、採用の最終承認者は伊藤翔。取締役会への上程基準は100万円以上の重要支出・契約・外注・借入・投資等を原則とする。</w:t>
             </w:r>
           </w:p>
         </w:tc>
@@ -7278,7 +7196,7 @@
                 <w:i w:val="0"/>
                 <w:sz w:val="18"/>
               </w:rPr>
-              <w:t>情報管理責任者、システム管理責任者、教育担当者、プライバシーポリシーURL、AI入力情報の詳細ルール、SaaS/ローカルLLM等のログ管理方針、インシデント時の社内連絡手段・顧客報告判断者</w:t>
+              <w:t>情報管理責任者、システム管理責任者、教育担当者、プライバシーポリシーURL、AI入力情報の詳細ルール、SaaS等のログ管理方針、インシデント時の社内連絡手段・顧客報告判断者</w:t>
             </w:r>
           </w:p>
         </w:tc>
@@ -7443,6 +7361,170 @@
                 <w:sz w:val="18"/>
               </w:rPr>
               <w:t>経営会議・取締役会への報告資料フォーマット、中期経営計画の毎期作成要否、上場後の業績予想開示規程との整合、Notionに追加する与信管理項目</w:t>
+            </w:r>
+          </w:p>
+        </w:tc>
+      </w:tr>
+      <w:tr>
+        <w:tc>
+          <w:tcPr>
+            <w:tcW w:type="dxa" w:w="2340"/>
+            <w:vAlign w:val="top"/>
+          </w:tcPr>
+          <w:p>
+            <w:pPr>
+              <w:spacing w:before="0" w:after="0" w:line="264" w:lineRule="auto"/>
+            </w:pPr>
+            <w:r>
+              <w:rPr>
+                <w:rFonts w:ascii="Yu Gothic" w:hAnsi="Yu Gothic" w:eastAsia="Yu Gothic" w:cs="Yu Gothic"/>
+                <w:b w:val="0"/>
+                <w:i w:val="0"/>
+                <w:sz w:val="18"/>
+              </w:rPr>
+              <w:t>2026-08-07</w:t>
+            </w:r>
+          </w:p>
+        </w:tc>
+        <w:tc>
+          <w:tcPr>
+            <w:tcW w:type="dxa" w:w="2340"/>
+            <w:vAlign w:val="top"/>
+          </w:tcPr>
+          <w:p>
+            <w:pPr>
+              <w:spacing w:before="0" w:after="0" w:line="264" w:lineRule="auto"/>
+            </w:pPr>
+            <w:r>
+              <w:rPr>
+                <w:rFonts w:ascii="Yu Gothic" w:hAnsi="Yu Gothic" w:eastAsia="Yu Gothic" w:cs="Yu Gothic"/>
+                <w:b w:val="0"/>
+                <w:i w:val="0"/>
+                <w:sz w:val="18"/>
+              </w:rPr>
+              <w:t>組織・担当者</w:t>
+            </w:r>
+          </w:p>
+        </w:tc>
+        <w:tc>
+          <w:tcPr>
+            <w:tcW w:type="dxa" w:w="2340"/>
+            <w:vAlign w:val="top"/>
+          </w:tcPr>
+          <w:p>
+            <w:pPr>
+              <w:spacing w:before="0" w:after="0" w:line="264" w:lineRule="auto"/>
+            </w:pPr>
+            <w:r>
+              <w:rPr>
+                <w:rFonts w:ascii="Yu Gothic" w:hAnsi="Yu Gothic" w:eastAsia="Yu Gothic" w:cs="Yu Gothic"/>
+                <w:b w:val="0"/>
+                <w:i w:val="0"/>
+                <w:sz w:val="18"/>
+              </w:rPr>
+              <w:t>営業部担当は土屋。塚原及び菅は業務委託として整理し、塚原は総務・人事及び契約確認の実務支援、菅は開発部の実務担当とする。安東は退職済みのため、現行組織の責任者又は担当者から除外する。業務委託者が担当又は支援する業務であっても、承認、決裁及び内部管理上の最終責任は社内責任者が負う前提で規程へ反映する。</w:t>
+            </w:r>
+          </w:p>
+        </w:tc>
+        <w:tc>
+          <w:tcPr>
+            <w:tcW w:type="dxa" w:w="2340"/>
+            <w:vAlign w:val="top"/>
+          </w:tcPr>
+          <w:p>
+            <w:pPr>
+              <w:spacing w:before="0" w:after="0" w:line="264" w:lineRule="auto"/>
+            </w:pPr>
+            <w:r>
+              <w:rPr>
+                <w:rFonts w:ascii="Yu Gothic" w:hAnsi="Yu Gothic" w:eastAsia="Yu Gothic" w:cs="Yu Gothic"/>
+                <w:b w:val="0"/>
+                <w:i w:val="0"/>
+                <w:sz w:val="18"/>
+              </w:rPr>
+              <w:t>開発部の社内管掌責任者、塚原が支援する総務・人事・契約確認業務の範囲、業務委託者の権限範囲及び契約書/NDA整備状況</w:t>
+            </w:r>
+          </w:p>
+        </w:tc>
+      </w:tr>
+      <w:tr>
+        <w:tc>
+          <w:tcPr>
+            <w:tcW w:type="dxa" w:w="2340"/>
+            <w:vAlign w:val="top"/>
+          </w:tcPr>
+          <w:p>
+            <w:pPr>
+              <w:spacing w:before="0" w:after="0" w:line="264" w:lineRule="auto"/>
+            </w:pPr>
+            <w:r>
+              <w:rPr>
+                <w:rFonts w:ascii="Yu Gothic" w:hAnsi="Yu Gothic" w:eastAsia="Yu Gothic" w:cs="Yu Gothic"/>
+                <w:b w:val="0"/>
+                <w:i w:val="0"/>
+                <w:sz w:val="18"/>
+              </w:rPr>
+              <w:t>2026-08-07</w:t>
+            </w:r>
+          </w:p>
+        </w:tc>
+        <w:tc>
+          <w:tcPr>
+            <w:tcW w:type="dxa" w:w="2340"/>
+            <w:vAlign w:val="top"/>
+          </w:tcPr>
+          <w:p>
+            <w:pPr>
+              <w:spacing w:before="0" w:after="0" w:line="264" w:lineRule="auto"/>
+            </w:pPr>
+            <w:r>
+              <w:rPr>
+                <w:rFonts w:ascii="Yu Gothic" w:hAnsi="Yu Gothic" w:eastAsia="Yu Gothic" w:cs="Yu Gothic"/>
+                <w:b w:val="0"/>
+                <w:i w:val="0"/>
+                <w:sz w:val="18"/>
+              </w:rPr>
+              <w:t>組織・事業部</w:t>
+            </w:r>
+          </w:p>
+        </w:tc>
+        <w:tc>
+          <w:tcPr>
+            <w:tcW w:type="dxa" w:w="2340"/>
+            <w:vAlign w:val="top"/>
+          </w:tcPr>
+          <w:p>
+            <w:pPr>
+              <w:spacing w:before="0" w:after="0" w:line="264" w:lineRule="auto"/>
+            </w:pPr>
+            <w:r>
+              <w:rPr>
+                <w:rFonts w:ascii="Yu Gothic" w:hAnsi="Yu Gothic" w:eastAsia="Yu Gothic" w:cs="Yu Gothic"/>
+                <w:b w:val="0"/>
+                <w:i w:val="0"/>
+                <w:sz w:val="18"/>
+              </w:rPr>
+              <w:t>旧3サービスは現行組織から除外する。キャリアコーチング事業を新規事業部配下に追加し、SaaS事業部を開発部配下に置く。</w:t>
+            </w:r>
+          </w:p>
+        </w:tc>
+        <w:tc>
+          <w:tcPr>
+            <w:tcW w:type="dxa" w:w="2340"/>
+            <w:vAlign w:val="top"/>
+          </w:tcPr>
+          <w:p>
+            <w:pPr>
+              <w:spacing w:before="0" w:after="0" w:line="264" w:lineRule="auto"/>
+            </w:pPr>
+            <w:r>
+              <w:rPr>
+                <w:rFonts w:ascii="Yu Gothic" w:hAnsi="Yu Gothic" w:eastAsia="Yu Gothic" w:cs="Yu Gothic"/>
+                <w:b w:val="0"/>
+                <w:i w:val="0"/>
+                <w:sz w:val="18"/>
+              </w:rPr>
+              <w:t>SaaS事業部の責任者、キャリアコーチング事業の責任者、SaaS事業部と開発部の承認・障害対応・売上管理の役割分担</w:t>
             </w:r>
           </w:p>
         </w:tc>

</xml_diff>